<commit_message>
Just a resume update
</commit_message>
<xml_diff>
--- a/public/resume.docx
+++ b/public/resume.docx
@@ -597,7 +597,7 @@
                 <w:sz w:val="18"/>
                 <w:szCs w:val="18"/>
               </w:rPr>
-              <w:t xml:space="preserve">2025</w:t>
+              <w:t xml:space="preserve">September 2026</w:t>
             </w:r>
           </w:p>
         </w:tc>
@@ -615,17 +615,17 @@
                 <w:sz w:val="20"/>
                 <w:szCs w:val="20"/>
               </w:rPr>
-              <w:t xml:space="preserve">VCA Animal Hospitals</w:t>
-            </w:r>
-          </w:p>
-          <w:p>
-            <w:r>
-              <w:rPr>
-                <w:rFonts w:ascii="FreeSans" w:cs="FreeSans" w:eastAsia="FreeSans" w:hAnsi="FreeSans"/>
-                <w:sz w:val="18"/>
-                <w:szCs w:val="18"/>
-              </w:rPr>
-              <w:t xml:space="preserve">Solutions Engineering</w:t>
+              <w:t xml:space="preserve">de Forest Technical</w:t>
+            </w:r>
+          </w:p>
+          <w:p>
+            <w:r>
+              <w:rPr>
+                <w:rFonts w:ascii="FreeSans" w:cs="FreeSans" w:eastAsia="FreeSans" w:hAnsi="FreeSans"/>
+                <w:sz w:val="18"/>
+                <w:szCs w:val="18"/>
+              </w:rPr>
+              <w:t xml:space="preserve">everything (it's just me)</w:t>
             </w:r>
           </w:p>
           <w:p>
@@ -637,6 +637,182 @@
                 <w:sz w:val="18"/>
                 <w:szCs w:val="18"/>
               </w:rPr>
+              <w:t xml:space="preserve">grand poobah</w:t>
+            </w:r>
+          </w:p>
+        </w:tc>
+        <w:tc>
+          <w:tcPr>
+            <w:tcW w:type="dxa" w:w="5745"/>
+            <w:vAlign w:val="top"/>
+          </w:tcPr>
+          <w:p>
+            <w:r>
+              <w:rPr>
+                <w:rFonts w:ascii="FreeSans" w:cs="FreeSans" w:eastAsia="FreeSans" w:hAnsi="FreeSans"/>
+                <w:sz w:val="14"/>
+                <w:szCs w:val="14"/>
+              </w:rPr>
+              <w:t xml:space="preserve">I'm spinning up an indie game development project. More to come...</w:t>
+            </w:r>
+          </w:p>
+          <w:p/>
+          <w:p>
+            <w:pPr>
+              <w:pStyle w:val="ListParagraph"/>
+              <w:numPr>
+                <w:ilvl w:val="0"/>
+                <w:numId w:val="2"/>
+              </w:numPr>
+              <w:spacing w:after="0" w:before="0" w:line="240"/>
+            </w:pPr>
+            <w:r>
+              <w:rPr>
+                <w:rFonts w:ascii="FreeSans" w:cs="FreeSans" w:eastAsia="FreeSans" w:hAnsi="FreeSans"/>
+                <w:sz w:val="14"/>
+                <w:szCs w:val="14"/>
+              </w:rPr>
+              <w:t xml:space="preserve">Desktop/server/network/hardware operations for</w:t>
+            </w:r>
+          </w:p>
+          <w:p>
+            <w:pPr>
+              <w:pStyle w:val="ListParagraph"/>
+              <w:numPr>
+                <w:ilvl w:val="1"/>
+                <w:numId w:val="2"/>
+              </w:numPr>
+              <w:spacing w:after="0" w:before="0" w:line="240"/>
+            </w:pPr>
+            <w:r>
+              <w:rPr>
+                <w:rFonts w:ascii="FreeSans" w:cs="FreeSans" w:eastAsia="FreeSans" w:hAnsi="FreeSans"/>
+                <w:sz w:val="14"/>
+                <w:szCs w:val="14"/>
+              </w:rPr>
+              <w:t xml:space="preserve">Got.net, an ISP with 2500 dial-up and web hosting customers</w:t>
+            </w:r>
+          </w:p>
+          <w:p>
+            <w:pPr>
+              <w:pStyle w:val="ListParagraph"/>
+              <w:numPr>
+                <w:ilvl w:val="1"/>
+                <w:numId w:val="2"/>
+              </w:numPr>
+              <w:spacing w:after="0" w:before="0" w:line="240"/>
+            </w:pPr>
+            <w:r>
+              <w:rPr>
+                <w:rFonts w:ascii="FreeSans" w:cs="FreeSans" w:eastAsia="FreeSans" w:hAnsi="FreeSans"/>
+                <w:sz w:val="14"/>
+                <w:szCs w:val="14"/>
+              </w:rPr>
+              <w:t xml:space="preserve">Coast Commercial Bank with six branches</w:t>
+            </w:r>
+          </w:p>
+          <w:p>
+            <w:pPr>
+              <w:pStyle w:val="ListParagraph"/>
+              <w:numPr>
+                <w:ilvl w:val="1"/>
+                <w:numId w:val="2"/>
+              </w:numPr>
+              <w:spacing w:after="0" w:before="0" w:line="240"/>
+            </w:pPr>
+            <w:r>
+              <w:rPr>
+                <w:rFonts w:ascii="FreeSans" w:cs="FreeSans" w:eastAsia="FreeSans" w:hAnsi="FreeSans"/>
+                <w:sz w:val="14"/>
+                <w:szCs w:val="14"/>
+              </w:rPr>
+              <w:t xml:space="preserve">Tapestry.net, a dot-com startup with 60 employees</w:t>
+            </w:r>
+          </w:p>
+        </w:tc>
+      </w:tr>
+      <w:tr>
+        <w:tc>
+          <w:tcPr>
+            <w:tcW w:type="dxa" w:w="936"/>
+            <w:vAlign w:val="top"/>
+          </w:tcPr>
+          <w:p>
+            <w:pPr>
+              <w:jc w:val="center"/>
+            </w:pPr>
+            <w:r>
+              <w:rPr>
+                <w:rFonts w:ascii="FreeSans" w:cs="FreeSans" w:eastAsia="FreeSans" w:hAnsi="FreeSans"/>
+                <w:sz w:val="18"/>
+                <w:szCs w:val="18"/>
+              </w:rPr>
+              <w:t xml:space="preserve">August 2026</w:t>
+            </w:r>
+          </w:p>
+          <w:p>
+            <w:pPr>
+              <w:jc w:val="center"/>
+            </w:pPr>
+            <w:r>
+              <w:rPr>
+                <w:rFonts w:ascii="FreeSans" w:cs="FreeSans" w:eastAsia="FreeSans" w:hAnsi="FreeSans"/>
+                <w:sz w:val="18"/>
+                <w:szCs w:val="18"/>
+              </w:rPr>
+              <w:t xml:space="preserve">to</w:t>
+            </w:r>
+          </w:p>
+          <w:p>
+            <w:pPr>
+              <w:jc w:val="center"/>
+            </w:pPr>
+            <w:r>
+              <w:rPr>
+                <w:rFonts w:ascii="FreeSans" w:cs="FreeSans" w:eastAsia="FreeSans" w:hAnsi="FreeSans"/>
+                <w:sz w:val="18"/>
+                <w:szCs w:val="18"/>
+              </w:rPr>
+              <w:t xml:space="preserve">May 2025</w:t>
+            </w:r>
+          </w:p>
+        </w:tc>
+        <w:tc>
+          <w:tcPr>
+            <w:tcW w:type="dxa" w:w="2340"/>
+            <w:vAlign w:val="top"/>
+          </w:tcPr>
+          <w:p>
+            <w:r>
+              <w:rPr>
+                <w:rFonts w:ascii="FreeSans" w:cs="FreeSans" w:eastAsia="FreeSans" w:hAnsi="FreeSans"/>
+                <w:b/>
+                <w:bCs/>
+                <w:sz w:val="20"/>
+                <w:szCs w:val="20"/>
+              </w:rPr>
+              <w:t xml:space="preserve">VCA Animal Hospitals</w:t>
+            </w:r>
+          </w:p>
+          <w:p>
+            <w:r>
+              <w:rPr>
+                <w:rFonts w:ascii="FreeSans" w:cs="FreeSans" w:eastAsia="FreeSans" w:hAnsi="FreeSans"/>
+                <w:sz w:val="18"/>
+                <w:szCs w:val="18"/>
+              </w:rPr>
+              <w:t xml:space="preserve">Solutions Engineering</w:t>
+            </w:r>
+          </w:p>
+          <w:p>
+            <w:r>
+              <w:rPr>
+                <w:rFonts w:ascii="FreeSans" w:cs="FreeSans" w:eastAsia="FreeSans" w:hAnsi="FreeSans"/>
+                <w:i/>
+                <w:iCs/>
+                <w:sz w:val="18"/>
+                <w:szCs w:val="18"/>
+              </w:rPr>
               <w:t xml:space="preserve">Product Manager, QA Lead, System Architect, Engineering Lead</w:t>
             </w:r>
           </w:p>
@@ -653,7 +829,7 @@
                 <w:sz w:val="14"/>
                 <w:szCs w:val="14"/>
               </w:rPr>
-              <w:t xml:space="preserve">I am product manager for a skunkworks project to improve VCA employee satisfaction with AI. Our current mandate is to learn about AI tech and how to integrate it with existing systems. I represent the customers (our employees) and provide guidence to the engineers based on my decades of experience. I also research LLMs specifically and how to use them safely.</w:t>
+              <w:t xml:space="preserve">I was product manager for a skunkworks project to use AI tech to improve VCA employee satisfaction. Our mandate was to learn about AI tech and how to integrate it with existing systems. I represent the customers (VCA employees) and provided guidence to the engineers based on my decades of experience. I also researched LLMs specifically and how to use them safely. In the end we delivered a working prototype and a QA framework including a user story, test and issue tracking app.</w:t>
             </w:r>
           </w:p>
           <w:p/>

</xml_diff>